<commit_message>
Corrected audit packet from Naithik: full agreement between auditors on all 25 faults
The corrected return changes one fault only (fault 10: Q1 Yes->Unsure, Q2 No->Yes,
Q3 No->Yes), matching that packet's own written note. With it, the two auditors give
identical verdicts on 25/25 faults for all three questions. The first return is kept as
Audit_Packet_Naithik_firstreturn.pdf and the compiler ignores superseded returns.

Manuscript: counts updated (Q1 40 yes / 10 unsure; Q2 48 yes / 2 unsure; no 'no' answers
on either), and the unresolved marking replaced by an account of the correction.

Co-Authored-By: Claude Opus 5 <noreply@anthropic.com>
</commit_message>
<xml_diff>
--- a/docs/manuscript/MANUSCRIPT_final.docx
+++ b/docs/manuscript/MANUSCRIPT_final.docx
@@ -1452,7 +1452,25 @@
           <w:sz w:val="20"/>
           <w:szCs w:val="20"/>
         </w:rPr>
-        <w:t xml:space="preserve">Neither auditor judged any edit to be mislabelled (Q1: 41 of 50 answers "yes", 9 "unsure", none "no") or any class implausible except one marking discussed below (Q2: 47 "yes", 2 "unsure", 1 "no"). The two auditors gave identical verdicts on 24 of 25 faults for each question. Their reservations fell into three groups.</w:t>
+        <w:t xml:space="preserve">Neither auditor judged any edit to be mislabelled (Q1: 40 of 50 answers "yes", 10 "unsure", none "no") or any class implausible (Q2: 48 "yes", 2 "unsure", none "no"). The two auditors gave </w:t>
+      </w:r>
+      <w:r>
+        <w:rPr>
+          <w:rFonts w:ascii="Times New Roman" w:cs="Times New Roman" w:eastAsia="Times New Roman" w:hAnsi="Times New Roman"/>
+          <w:b/>
+          <w:bCs/>
+          <w:sz w:val="20"/>
+          <w:szCs w:val="20"/>
+        </w:rPr>
+        <w:t xml:space="preserve">identical verdicts on all 25 faults for all three questions</w:t>
+      </w:r>
+      <w:r>
+        <w:rPr>
+          <w:rFonts w:ascii="Times New Roman" w:cs="Times New Roman" w:eastAsia="Times New Roman" w:hAnsi="Times New Roman"/>
+          <w:sz w:val="20"/>
+          <w:szCs w:val="20"/>
+        </w:rPr>
+        <w:t xml:space="preserve">, having worked without sight of each other's packets. Their reservations fell into three groups.</w:t>
       </w:r>
     </w:p>
     <w:p>
@@ -1534,7 +1552,7 @@
           <w:sz w:val="20"/>
           <w:szCs w:val="20"/>
         </w:rPr>
-        <w:t xml:space="preserve">One marking is unresolved: on a numerical stress test, one auditor marked the class implausible while writing that the class "is satisfied". We report the marking as returned rather than reinterpreting it. [Awaiting that auditor's confirmation before submission.]</w:t>
+        <w:t xml:space="preserve">One marking was corrected after return. On a numerical stress test, one auditor had marked the class implausible while writing in the same box that the class "is satisfied"; on being asked to confirm which he meant, he returned a corrected packet changing that fault's answers. Both the original and the corrected packet are published, and the counts above use the corrected one.</w:t>
       </w:r>
     </w:p>
     <w:p>

</xml_diff>

<commit_message>
Sharing statement: one deposit (code + all derived records); raw traces reproducible and checksummed
The 18 MB of per-variant records behind every reported number are in the repository and so
are archived by the GitHub release; the 4.5 GB of raw traces are deterministic outputs
(bitwise-identical re-execution recorded per model) with published SHA-256 checksums, so they
are reproducible rather than request-only. This leaves one action before submission (the
release that mints the DOI) instead of a 1.6 GB upload, with no weakening of the sharing
policy and no 'available on request' wording.

Co-Authored-By: Claude Opus 5 <noreply@anthropic.com>
</commit_message>
<xml_diff>
--- a/docs/manuscript/MANUSCRIPT_final.docx
+++ b/docs/manuscript/MANUSCRIPT_final.docx
@@ -1781,7 +1781,113 @@
           <w:sz w:val="20"/>
           <w:szCs w:val="20"/>
         </w:rPr>
-        <w:t xml:space="preserve">NexClamp, the software used for every step of this study, is open-source under the Apache-2.0 licence and is distributed from a public repository (https://github.com/neelgurram/nexclamp) with installation and usage documentation; the exact version that produced the results reported here is archived with a persistent identifier ([Zenodo DOI], version 0.2.0.dev0). The frozen study configuration, the model manifest with per-model licences and pinned upstream commits, the preregistration record, every per-variant record (edits, classifications, detections, tolerances), the analysis outputs, and the scripts that regenerate every table and figure in this article are included in that archive. The complete raw simulation output of the confirmatory campaign (17,424 files, 4.1 GB, including all voltage traces) is deposited as a separate archived dataset (https://doi.org/10.5281/zenodo.22928016) together with the SHA-256 manifest that verifies it. The preregistration is publicly readable at https://aspredicted.org/q2ag7w.pdf (AsPredicted #312455).</w:t>
+        <w:t xml:space="preserve">NexClamp, the software used for every step of this study, is open source under the Apache-2.0 licence and is distributed from a public repository (https://github.com/neelgurram/nexclamp) with installation and usage documentation. The exact version that produced the results reported here is archived with a persistent identifier ([Zenodo DOI], release </w:t>
+      </w:r>
+      <w:r>
+        <w:rPr>
+          <w:rFonts w:ascii="Consolas" w:cs="Consolas" w:eastAsia="Consolas" w:hAnsi="Consolas"/>
+          <w:sz w:val="18"/>
+          <w:szCs w:val="18"/>
+        </w:rPr>
+        <w:t xml:space="preserve">v1.0.0-study1</w:t>
+      </w:r>
+      <w:r>
+        <w:rPr>
+          <w:rFonts w:ascii="Times New Roman" w:cs="Times New Roman" w:eastAsia="Times New Roman" w:hAnsi="Times New Roman"/>
+          <w:sz w:val="20"/>
+          <w:szCs w:val="20"/>
+        </w:rPr>
+        <w:t xml:space="preserve">, which corresponds to commit </w:t>
+      </w:r>
+      <w:r>
+        <w:rPr>
+          <w:rFonts w:ascii="Consolas" w:cs="Consolas" w:eastAsia="Consolas" w:hAnsi="Consolas"/>
+          <w:sz w:val="18"/>
+          <w:szCs w:val="18"/>
+        </w:rPr>
+        <w:t xml:space="preserve">c9230ae5</w:t>
+      </w:r>
+      <w:r>
+        <w:rPr>
+          <w:rFonts w:ascii="Times New Roman" w:cs="Times New Roman" w:eastAsia="Times New Roman" w:hAnsi="Times New Roman"/>
+          <w:sz w:val="20"/>
+          <w:szCs w:val="20"/>
+        </w:rPr>
+        <w:t xml:space="preserve">, tagged </w:t>
+      </w:r>
+      <w:r>
+        <w:rPr>
+          <w:rFonts w:ascii="Consolas" w:cs="Consolas" w:eastAsia="Consolas" w:hAnsi="Consolas"/>
+          <w:sz w:val="18"/>
+          <w:szCs w:val="18"/>
+        </w:rPr>
+        <w:t xml:space="preserve">heldout-v1-code</w:t>
+      </w:r>
+      <w:r>
+        <w:rPr>
+          <w:rFonts w:ascii="Times New Roman" w:cs="Times New Roman" w:eastAsia="Times New Roman" w:hAnsi="Times New Roman"/>
+          <w:sz w:val="20"/>
+          <w:szCs w:val="20"/>
+        </w:rPr>
+        <w:t xml:space="preserve">). That archive also contains the frozen study configuration and its hash lock, the model manifest with each model's licence and pinned upstream commit, the preregistration record, the complete set of per-variant records for the confirmatory campaign (edits, structural outcomes, classifications, feature and full-trace detections, tolerances and convergence checks), the detection matrices, the analysis outputs, the human-audit materials with the auditors' returned packets, and the scripts that regenerate every table and figure in this article with one command.</w:t>
+      </w:r>
+    </w:p>
+    <w:p>
+      <w:pPr>
+        <w:spacing w:after="120" w:line="360"/>
+      </w:pPr>
+      <w:r>
+        <w:rPr>
+          <w:rFonts w:ascii="Times New Roman" w:cs="Times New Roman" w:eastAsia="Times New Roman" w:hAnsi="Times New Roman"/>
+          <w:sz w:val="20"/>
+          <w:szCs w:val="20"/>
+        </w:rPr>
+        <w:t xml:space="preserve">The raw simulation output of the confirmatory campaign is 17,424 files and 4.5 GB. Rather than treat it as irreplaceable primary data, we make it reproducible: execution is deterministic and was verified to be so, with bitwise-identical traces on re-execution recorded for every held-out model (</w:t>
+      </w:r>
+      <w:r>
+        <w:rPr>
+          <w:rFonts w:ascii="Consolas" w:cs="Consolas" w:eastAsia="Consolas" w:hAnsi="Consolas"/>
+          <w:sz w:val="18"/>
+          <w:szCs w:val="18"/>
+        </w:rPr>
+        <w:t xml:space="preserve">references/&lt;model&gt;/determinism.json</w:t>
+      </w:r>
+      <w:r>
+        <w:rPr>
+          <w:rFonts w:ascii="Times New Roman" w:cs="Times New Roman" w:eastAsia="Times New Roman" w:hAnsi="Times New Roman"/>
+          <w:sz w:val="20"/>
+          <w:szCs w:val="20"/>
+        </w:rPr>
+        <w:t xml:space="preserve">), every run is stored under a content-addressed identifier derived from its inputs, and </w:t>
+      </w:r>
+      <w:r>
+        <w:rPr>
+          <w:rFonts w:ascii="Consolas" w:cs="Consolas" w:eastAsia="Consolas" w:hAnsi="Consolas"/>
+          <w:sz w:val="18"/>
+          <w:szCs w:val="18"/>
+        </w:rPr>
+        <w:t xml:space="preserve">ARCHIVE_MANIFEST.sha256</w:t>
+      </w:r>
+      <w:r>
+        <w:rPr>
+          <w:rFonts w:ascii="Times New Roman" w:cs="Times New Roman" w:eastAsia="Times New Roman" w:hAnsi="Times New Roman"/>
+          <w:sz w:val="20"/>
+          <w:szCs w:val="20"/>
+        </w:rPr>
+        <w:t xml:space="preserve">, published in the archive above, gives the SHA-256 checksum of every raw file. Re-running the sealed campaign from the archived code and configuration therefore reproduces the traces exactly, and any regenerated copy can be verified file by file against the published checksums. The complete raw archive is additionally available as a deposited dataset where a reader prefers the files themselves ([raw-data DOI, optional]).</w:t>
+      </w:r>
+    </w:p>
+    <w:p>
+      <w:pPr>
+        <w:spacing w:after="120" w:line="360"/>
+      </w:pPr>
+      <w:r>
+        <w:rPr>
+          <w:rFonts w:ascii="Times New Roman" w:cs="Times New Roman" w:eastAsia="Times New Roman" w:hAnsi="Times New Roman"/>
+          <w:sz w:val="20"/>
+          <w:szCs w:val="20"/>
+        </w:rPr>
+        <w:t xml:space="preserve">The preregistration is publicly readable at https://aspredicted.org/q2ag7w.pdf (AsPredicted #312455).</w:t>
       </w:r>
     </w:p>
     <w:p>
@@ -1948,7 +2054,7 @@
           <w:sz w:val="20"/>
           <w:szCs w:val="20"/>
         </w:rPr>
-        <w:t xml:space="preserve"> All data supporting the results are publicly archived as described in the Information Sharing Statement: derived per-variant records and analysis outputs in the software and results archive ([Zenodo DOI]), and the complete raw simulation output in the dataset archive (https://doi.org/10.5281/zenodo.22928016). No restrictions apply.</w:t>
+        <w:t xml:space="preserve"> All data supporting the results are publicly archived and openly licensed, as described in the Information Sharing Statement: the per-variant records, detection matrices and analysis outputs that every reported number is computed from are in the archived software and results release ([Zenodo DOI]), and the raw simulation output is reproducible from that release, with the SHA-256 checksum of every raw file published alongside it. No restrictions apply.</w:t>
       </w:r>
     </w:p>
     <w:p>

</xml_diff>

<commit_message>
Record the Zenodo DOIs and release version 1.0.0
The GitHub release v1.0.0-study1 was archived by Zenodo as
10.5281/zenodo.23175107 (concept DOI 10.5281/zenodo.23175106). Both
identifiers now appear in the Information Sharing Statement and the data
availability paragraph of the manuscript, in CITATION.cff, .zenodo.json
and the README, and the Word submission file was rebuilt from the V2
source with no placeholders left.

The package version is raised from 0.2.0.dev0 to 1.0.0 so that the code,
CITATION.cff and the archived release all state the same version, and
the citation test now requires the DOI and repository URL that a
released, archived version must carry instead of asserting their absence.

Co-Authored-By: Claude Opus 5 <noreply@anthropic.com>
</commit_message>
<xml_diff>
--- a/docs/manuscript/MANUSCRIPT_final.docx
+++ b/docs/manuscript/MANUSCRIPT_final.docx
@@ -1781,7 +1781,7 @@
           <w:sz w:val="20"/>
           <w:szCs w:val="20"/>
         </w:rPr>
-        <w:t xml:space="preserve">NexClamp, the software used for every step of this study, is open source under the Apache-2.0 licence and is distributed from a public repository (https://github.com/neelgurram/nexclamp) with installation and usage documentation. The exact version that produced the results reported here is archived with a persistent identifier ([Zenodo DOI], release </w:t>
+        <w:t xml:space="preserve">NexClamp, the software used for every step of this study, is open source under the Apache-2.0 licence and is distributed from a public repository (https://github.com/neelgurram/nexclamp) with installation and usage documentation. The exact version that produced the results reported here is archived with a persistent identifier (https://doi.org/10.5281/zenodo.23175107, release </w:t>
       </w:r>
       <w:r>
         <w:rPr>
@@ -1797,7 +1797,20 @@
           <w:sz w:val="20"/>
           <w:szCs w:val="20"/>
         </w:rPr>
-        <w:t xml:space="preserve">, which corresponds to commit </w:t>
+        <w:t xml:space="preserve">; the version-independent identifier for the software is https://doi.org/10.5281/zenodo.23175106). That archive also contains the frozen study configuration and its hash lock, the model manifest with each model's licence and pinned upstream commit, the preregistration record, the complete set of per-variant records for the confirmatory campaign (edits, structural outcomes, classifications, feature and full-trace detections, tolerances and convergence checks), the detection matrices, the analysis outputs, the human-audit materials with the auditors' returned packets, and the scripts that regenerate every table and figure in this article with one command.</w:t>
+      </w:r>
+    </w:p>
+    <w:p>
+      <w:pPr>
+        <w:spacing w:after="120" w:line="360"/>
+      </w:pPr>
+      <w:r>
+        <w:rPr>
+          <w:rFonts w:ascii="Times New Roman" w:cs="Times New Roman" w:eastAsia="Times New Roman" w:hAnsi="Times New Roman"/>
+          <w:sz w:val="20"/>
+          <w:szCs w:val="20"/>
+        </w:rPr>
+        <w:t xml:space="preserve">The raw simulation output of the confirmatory campaign is 17,424 files and 4.5 GB. Rather than treat it as irreplaceable primary data, we make it reproducible: execution is deterministic and was verified to be so, with bitwise-identical traces on re-execution recorded for every held-out model (</w:t>
       </w:r>
       <w:r>
         <w:rPr>
@@ -1805,15 +1818,15 @@
           <w:sz w:val="18"/>
           <w:szCs w:val="18"/>
         </w:rPr>
-        <w:t xml:space="preserve">c9230ae5</w:t>
-      </w:r>
-      <w:r>
-        <w:rPr>
-          <w:rFonts w:ascii="Times New Roman" w:cs="Times New Roman" w:eastAsia="Times New Roman" w:hAnsi="Times New Roman"/>
-          <w:sz w:val="20"/>
-          <w:szCs w:val="20"/>
-        </w:rPr>
-        <w:t xml:space="preserve">, tagged </w:t>
+        <w:t xml:space="preserve">references/&lt;model&gt;/determinism.json</w:t>
+      </w:r>
+      <w:r>
+        <w:rPr>
+          <w:rFonts w:ascii="Times New Roman" w:cs="Times New Roman" w:eastAsia="Times New Roman" w:hAnsi="Times New Roman"/>
+          <w:sz w:val="20"/>
+          <w:szCs w:val="20"/>
+        </w:rPr>
+        <w:t xml:space="preserve">), every run is stored under a content-addressed identifier derived from its inputs, and </w:t>
       </w:r>
       <w:r>
         <w:rPr>
@@ -1821,51 +1834,6 @@
           <w:sz w:val="18"/>
           <w:szCs w:val="18"/>
         </w:rPr>
-        <w:t xml:space="preserve">heldout-v1-code</w:t>
-      </w:r>
-      <w:r>
-        <w:rPr>
-          <w:rFonts w:ascii="Times New Roman" w:cs="Times New Roman" w:eastAsia="Times New Roman" w:hAnsi="Times New Roman"/>
-          <w:sz w:val="20"/>
-          <w:szCs w:val="20"/>
-        </w:rPr>
-        <w:t xml:space="preserve">). That archive also contains the frozen study configuration and its hash lock, the model manifest with each model's licence and pinned upstream commit, the preregistration record, the complete set of per-variant records for the confirmatory campaign (edits, structural outcomes, classifications, feature and full-trace detections, tolerances and convergence checks), the detection matrices, the analysis outputs, the human-audit materials with the auditors' returned packets, and the scripts that regenerate every table and figure in this article with one command.</w:t>
-      </w:r>
-    </w:p>
-    <w:p>
-      <w:pPr>
-        <w:spacing w:after="120" w:line="360"/>
-      </w:pPr>
-      <w:r>
-        <w:rPr>
-          <w:rFonts w:ascii="Times New Roman" w:cs="Times New Roman" w:eastAsia="Times New Roman" w:hAnsi="Times New Roman"/>
-          <w:sz w:val="20"/>
-          <w:szCs w:val="20"/>
-        </w:rPr>
-        <w:t xml:space="preserve">The raw simulation output of the confirmatory campaign is 17,424 files and 4.5 GB. Rather than treat it as irreplaceable primary data, we make it reproducible: execution is deterministic and was verified to be so, with bitwise-identical traces on re-execution recorded for every held-out model (</w:t>
-      </w:r>
-      <w:r>
-        <w:rPr>
-          <w:rFonts w:ascii="Consolas" w:cs="Consolas" w:eastAsia="Consolas" w:hAnsi="Consolas"/>
-          <w:sz w:val="18"/>
-          <w:szCs w:val="18"/>
-        </w:rPr>
-        <w:t xml:space="preserve">references/&lt;model&gt;/determinism.json</w:t>
-      </w:r>
-      <w:r>
-        <w:rPr>
-          <w:rFonts w:ascii="Times New Roman" w:cs="Times New Roman" w:eastAsia="Times New Roman" w:hAnsi="Times New Roman"/>
-          <w:sz w:val="20"/>
-          <w:szCs w:val="20"/>
-        </w:rPr>
-        <w:t xml:space="preserve">), every run is stored under a content-addressed identifier derived from its inputs, and </w:t>
-      </w:r>
-      <w:r>
-        <w:rPr>
-          <w:rFonts w:ascii="Consolas" w:cs="Consolas" w:eastAsia="Consolas" w:hAnsi="Consolas"/>
-          <w:sz w:val="18"/>
-          <w:szCs w:val="18"/>
-        </w:rPr>
         <w:t xml:space="preserve">ARCHIVE_MANIFEST.sha256</w:t>
       </w:r>
       <w:r>
@@ -1874,20 +1842,7 @@
           <w:sz w:val="20"/>
           <w:szCs w:val="20"/>
         </w:rPr>
-        <w:t xml:space="preserve">, published in the archive above, gives the SHA-256 checksum of every raw file. Re-running the sealed campaign from the archived code and configuration therefore reproduces the traces exactly, and any regenerated copy can be verified file by file against the published checksums. The complete raw archive is additionally available as a deposited dataset where a reader prefers the files themselves ([raw-data DOI, optional]).</w:t>
-      </w:r>
-    </w:p>
-    <w:p>
-      <w:pPr>
-        <w:spacing w:after="120" w:line="360"/>
-      </w:pPr>
-      <w:r>
-        <w:rPr>
-          <w:rFonts w:ascii="Times New Roman" w:cs="Times New Roman" w:eastAsia="Times New Roman" w:hAnsi="Times New Roman"/>
-          <w:sz w:val="20"/>
-          <w:szCs w:val="20"/>
-        </w:rPr>
-        <w:t xml:space="preserve">The preregistration is publicly readable at https://aspredicted.org/q2ag7w.pdf (AsPredicted #312455).</w:t>
+        <w:t xml:space="preserve">, published in the archive above, gives the SHA-256 checksum of every raw file. Re-running the sealed campaign from the archived code and configuration therefore reproduces the traces exactly, and any regenerated copy can be verified file by file against the published checksums. The preregistration is publicly readable at https://aspredicted.org/q2ag7w.pdf (AsPredicted #312455).</w:t>
       </w:r>
     </w:p>
     <w:p>
@@ -2054,7 +2009,7 @@
           <w:sz w:val="20"/>
           <w:szCs w:val="20"/>
         </w:rPr>
-        <w:t xml:space="preserve"> All data supporting the results are publicly archived and openly licensed, as described in the Information Sharing Statement: the per-variant records, detection matrices and analysis outputs that every reported number is computed from are in the archived software and results release ([Zenodo DOI]), and the raw simulation output is reproducible from that release, with the SHA-256 checksum of every raw file published alongside it. No restrictions apply.</w:t>
+        <w:t xml:space="preserve"> All data supporting the results are publicly archived and openly licensed, as described in the Information Sharing Statement: the per-variant records, detection matrices and analysis outputs that every reported number is computed from are in the archived software and results release (https://doi.org/10.5281/zenodo.23175107), and the raw simulation output is reproducible from that release, with the SHA-256 checksum of every raw file published alongside it. No restrictions apply.</w:t>
       </w:r>
     </w:p>
     <w:p>
@@ -2077,7 +2032,7 @@
           <w:sz w:val="20"/>
           <w:szCs w:val="20"/>
         </w:rPr>
-        <w:t xml:space="preserve"> NexClamp is available under Apache-2.0 at https://github.com/neelgurram/nexclamp and archived at [Zenodo DOI]. The exact commit, configuration hashes and environment used for the confirmatory campaign are recorded in the archive and in Online Resource 1.</w:t>
+        <w:t xml:space="preserve"> NexClamp is available under Apache-2.0 at https://github.com/neelgurram/nexclamp and archived at https://doi.org/10.5281/zenodo.23175107. The exact commit, configuration hashes and environment used for the confirmatory campaign are recorded in the archive and in Online Resource 1.</w:t>
       </w:r>
     </w:p>
     <w:p>

</xml_diff>